<commit_message>
word: generate HIRO2026 Word templates
</commit_message>
<xml_diff>
--- a/word/hiro2026-essay.docx
+++ b/word/hiro2026-essay.docx
@@ -7,15 +7,23 @@
         <w:tblW w:type="auto" w:w="0"/>
         <w:tblLayout w:type="fixed"/>
         <w:tblLook w:firstColumn="1" w:firstRow="1" w:lastColumn="0" w:lastRow="0" w:noHBand="0" w:noVBand="1" w:val="04A0"/>
+        <w:tblBorders>
+          <w:top w:val="nil"/>
+          <w:left w:val="nil"/>
+          <w:bottom w:val="nil"/>
+          <w:right w:val="nil"/>
+          <w:insideH w:val="nil"/>
+          <w:insideV w:val="nil"/>
+        </w:tblBorders>
       </w:tblPr>
       <w:tblGrid>
-        <w:gridCol w:w="3118"/>
-        <w:gridCol w:w="5556"/>
+        <w:gridCol w:w="4394"/>
+        <w:gridCol w:w="4394"/>
       </w:tblGrid>
       <w:tr>
         <w:tc>
           <w:tcPr>
-            <w:tcW w:type="dxa" w:w="4394"/>
+            <w:tcW w:type="dxa" w:w="3089"/>
             <w:tcMar>
               <w:top w:w="0" w:type="dxa"/>
               <w:start w:w="0" w:type="dxa"/>
@@ -25,6 +33,9 @@
             <w:vAlign w:val="center"/>
           </w:tcPr>
           <w:p>
+            <w:pPr>
+              <w:spacing w:after="0" w:line="240" w:lineRule="auto"/>
+            </w:pPr>
             <w:r>
               <w:drawing>
                 <wp:inline xmlns:a="http://schemas.openxmlformats.org/drawingml/2006/main" xmlns:pic="http://schemas.openxmlformats.org/drawingml/2006/picture">
@@ -41,7 +52,7 @@
                           <pic:cNvPicPr/>
                         </pic:nvPicPr>
                         <pic:blipFill>
-                          <a:blip r:embed="rId12"/>
+                          <a:blip r:embed="rId11"/>
                           <a:stretch>
                             <a:fillRect/>
                           </a:stretch>
@@ -63,7 +74,7 @@
         </w:tc>
         <w:tc>
           <w:tcPr>
-            <w:tcW w:type="dxa" w:w="4394"/>
+            <w:tcW w:type="dxa" w:w="5697"/>
             <w:tcMar>
               <w:top w:w="0" w:type="dxa"/>
               <w:start w:w="0" w:type="dxa"/>
@@ -74,7 +85,7 @@
           </w:tcPr>
           <w:p>
             <w:pPr>
-              <w:pStyle w:val="HIROPublicationMeta"/>
+              <w:pStyle w:val="ATPubMeta"/>
             </w:pPr>
             <w:r>
               <w:t>HIRO2026 / 篠泽广研讨会</w:t>
@@ -82,7 +93,7 @@
           </w:p>
           <w:p>
             <w:pPr>
-              <w:pStyle w:val="HIROPublicationMeta"/>
+              <w:pStyle w:val="ATPubMeta"/>
             </w:pPr>
             <w:r>
               <w:t>SHINOSAWA HIRO / ACGN STUDIES / LONGFORM</w:t>
@@ -90,10 +101,10 @@
           </w:p>
           <w:p>
             <w:pPr>
-              <w:pStyle w:val="HIROPublicationMeta"/>
+              <w:pStyle w:val="ATPubMeta"/>
             </w:pPr>
             <w:r>
-              <w:t>2026 · 第三方非官方支援项目</w:t>
+              <w:t>2026  ·  第三方非官方支援项目</w:t>
             </w:r>
           </w:p>
         </w:tc>
@@ -101,51 +112,51 @@
     </w:tbl>
     <w:p>
       <w:pPr>
+        <w:spacing w:before="238" w:after="0"/>
         <w:pBdr>
-          <w:bottom w:val="single" w:sz="4" w:space="1" w:color="C6C6C0"/>
+          <w:bottom w:val="single" w:sz="3" w:space="0" w:color="C9CDD4"/>
         </w:pBdr>
-        <w:spacing w:after="480"/>
       </w:pPr>
     </w:p>
     <w:p>
       <w:pPr>
-        <w:pStyle w:val="HIROKicker"/>
-        <w:spacing w:before="80"/>
+        <w:spacing w:after="567" w:line="20" w:lineRule="exact"/>
+      </w:pPr>
+    </w:p>
+    <w:p>
+      <w:pPr>
+        <w:pStyle w:val="ATKicker"/>
+        <w:spacing w:after="198"/>
       </w:pPr>
       <w:r>
-        <w:t>[KICKER / SHORT DESCRIPTOR]</w:t>
+        <w:t>篠泽广 / 第三方支援项目</w:t>
       </w:r>
     </w:p>
     <w:p>
       <w:pPr>
-        <w:pStyle w:val="HIROTitle"/>
+        <w:pStyle w:val="ATTitle"/>
+        <w:spacing w:after="215"/>
       </w:pPr>
       <w:r>
-        <w:t>[文章标题 / TITLE]</w:t>
+        <w:t>HIRO2026 非官方支援排版模板</w:t>
       </w:r>
     </w:p>
     <w:p>
       <w:pPr>
-        <w:pStyle w:val="HIROSubtitle"/>
+        <w:pStyle w:val="ATSubtitle"/>
+        <w:spacing w:after="0"/>
       </w:pPr>
       <w:r>
-        <w:t>[副标题 / SUBTITLE]</w:t>
+        <w:t>维护者个人发起，基于 AtelierTeX 制作</w:t>
       </w:r>
     </w:p>
     <w:p>
       <w:pPr>
-        <w:pStyle w:val="HIROEnglishTitle"/>
+        <w:pStyle w:val="ATDeck"/>
+        <w:spacing w:before="312" w:after="369"/>
       </w:pPr>
       <w:r>
-        <w:t>[English Title]</w:t>
-      </w:r>
-    </w:p>
-    <w:p>
-      <w:pPr>
-        <w:pStyle w:val="HIRODeck"/>
-      </w:pPr>
-      <w:r>
-        <w:t>[一句承担阅读入口、而非摘要功能的导语 / HIRODeck]</w:t>
+        <w:t>随笔刊页把阅读入口、作者信息与正文开篇放在同一页面，同时继续使用 HIRO2026 的刊头、章节、图表和参考文献体系。</w:t>
       </w:r>
     </w:p>
     <w:tbl>
@@ -153,15 +164,23 @@
         <w:tblW w:type="auto" w:w="0"/>
         <w:tblLayout w:type="fixed"/>
         <w:tblLook w:firstColumn="1" w:firstRow="1" w:lastColumn="0" w:lastRow="0" w:noHBand="0" w:noVBand="1" w:val="04A0"/>
+        <w:tblBorders>
+          <w:top w:val="nil"/>
+          <w:left w:val="nil"/>
+          <w:bottom w:val="nil"/>
+          <w:right w:val="nil"/>
+          <w:insideH w:val="nil"/>
+          <w:insideV w:val="nil"/>
+        </w:tblBorders>
       </w:tblPr>
       <w:tblGrid>
-        <w:gridCol w:w="5669"/>
-        <w:gridCol w:w="3005"/>
+        <w:gridCol w:w="4394"/>
+        <w:gridCol w:w="4394"/>
       </w:tblGrid>
       <w:tr>
         <w:tc>
           <w:tcPr>
-            <w:tcW w:type="dxa" w:w="4394"/>
+            <w:tcW w:type="dxa" w:w="6009"/>
             <w:tcMar>
               <w:top w:w="0" w:type="dxa"/>
               <w:start w:w="0" w:type="dxa"/>
@@ -171,24 +190,24 @@
           </w:tcPr>
           <w:p>
             <w:pPr>
-              <w:pStyle w:val="HIROAuthor"/>
+              <w:pStyle w:val="ATEssayAuthor"/>
             </w:pPr>
             <w:r>
-              <w:t>[作者 / AUTHOR]</w:t>
+              <w:t>54wsdf / 个人支援项目</w:t>
             </w:r>
           </w:p>
           <w:p>
             <w:pPr>
-              <w:pStyle w:val="HIROAffiliation"/>
+              <w:pStyle w:val="ATEssayAffiliation"/>
             </w:pPr>
             <w:r>
-              <w:t>[单位 / 社团 / 研究机构]</w:t>
+              <w:t>面向 HIRO2026 的非官方排版与投稿支援</w:t>
             </w:r>
           </w:p>
         </w:tc>
         <w:tc>
           <w:tcPr>
-            <w:tcW w:type="dxa" w:w="4394"/>
+            <w:tcW w:type="dxa" w:w="2777"/>
             <w:tcMar>
               <w:top w:w="0" w:type="dxa"/>
               <w:start w:w="0" w:type="dxa"/>
@@ -198,10 +217,10 @@
           </w:tcPr>
           <w:p>
             <w:pPr>
-              <w:pStyle w:val="HIRODocumentMeta"/>
+              <w:pStyle w:val="ATDocumentMeta"/>
             </w:pPr>
             <w:r>
-              <w:t>[PAPER TYPE / HIRO2026-XXX]</w:t>
+              <w:t>第三方支援样张 / HIRO2026-DEMO</w:t>
             </w:r>
           </w:p>
         </w:tc>
@@ -209,92 +228,60 @@
     </w:tbl>
     <w:p>
       <w:pPr>
-        <w:pStyle w:val="HIROAuthorNote"/>
+        <w:pStyle w:val="ATNote"/>
+        <w:spacing w:before="102" w:after="397"/>
       </w:pPr>
       <w:r>
-        <w:t>[作者说明 / 非官方声明 / 可删除]</w:t>
-      </w:r>
-    </w:p>
-    <w:p>
-      <w:pPr>
-        <w:spacing w:before="160" w:after="160"/>
-        <w:jc w:val="center"/>
-        <w:pBdr>
-          <w:top w:val="single" w:sz="4" w:color="C6C6C0"/>
-          <w:left w:val="single" w:sz="4" w:color="C6C6C0"/>
-          <w:bottom w:val="single" w:sz="4" w:color="C6C6C0"/>
-          <w:right w:val="single" w:sz="4" w:color="C6C6C0"/>
-        </w:pBdr>
-      </w:pPr>
-      <w:r>
-        <w:rPr>
-          <w:rFonts w:ascii="Noto Serif" w:hAnsi="Noto Serif" w:eastAsia="Noto Serif" w:cs="Noto Serif"/>
-          <w:color w:val="666662"/>
-          <w:sz w:val="17"/>
-        </w:rPr>
-        <w:br/>
-        <w:br/>
-        <w:br/>
-        <w:br/>
-        <w:t>[可选叙事照片 / HIROHeroImage]</w:t>
-        <w:br/>
-        <w:br/>
-        <w:br/>
-        <w:br/>
-      </w:r>
-    </w:p>
-    <w:p>
-      <w:pPr>
-        <w:pStyle w:val="HIROFigureSource"/>
-      </w:pPr>
-      <w:r>
-        <w:t>[照片说明 / HIROHeroCaption]</w:t>
-      </w:r>
-    </w:p>
-    <w:p>
-      <w:pPr>
-        <w:pStyle w:val="HIROFigureSource"/>
-      </w:pPr>
-      <w:r>
-        <w:t>[来源 / HIROHeroCredit]</w:t>
+        <w:t>本项目纯属个人制作，不是 HIRO2026 官方模板，与活动主办方无隶属、委托、合作或代表关系。活动规则以活动页面为准。</w:t>
       </w:r>
     </w:p>
     <w:p>
       <w:pPr>
         <w:pStyle w:val="HIROAbstract"/>
+        <w:spacing w:after="113"/>
       </w:pPr>
       <w:r>
         <w:rPr>
-          <w:rFonts w:ascii="Noto Sans" w:hAnsi="Noto Sans" w:eastAsia="Noto Sans" w:cs="Noto Sans"/>
+          <w:rFonts w:ascii="Noto Sans" w:hAnsi="Noto Sans" w:cs="Noto Sans" w:eastAsia="Noto Sans CJK SC"/>
           <w:b/>
           <w:color w:val="111111"/>
           <w:sz w:val="17"/>
         </w:rPr>
-        <w:t xml:space="preserve">摘  要 </w:t>
+        <w:t>摘　要</w:t>
       </w:r>
       <w:r>
-        <w:t>[在此填写摘要。]</w:t>
+        <w:t xml:space="preserve">　本样张展示维护者个人发起、面向篠泽广研讨会（HIRO2026）的第三方非官方 LaTeX 支援模板。模板建立在 AtelierTeX 的多语种长文框架与 ATX-ACGN-REF 跨媒介引用体系之上，为 HIRO2026 主题写作提供刊头、题名区、章节层级、叙事环境与参考文献视觉。本项目与 HIRO2026 官方及活动主办方没有关系；活动日程、投稿规则与最终要求始终以活动网站公布的信息为准。</w:t>
       </w:r>
     </w:p>
     <w:p>
       <w:pPr>
         <w:pStyle w:val="HIROKeywords"/>
+        <w:spacing w:after="312"/>
         <w:pBdr>
-          <w:bottom w:val="single" w:sz="4" w:space="1" w:color="C6C6C0"/>
+          <w:bottom w:val="single" w:sz="3" w:space="0" w:color="C6C6C0"/>
         </w:pBdr>
-        <w:spacing w:after="320"/>
       </w:pPr>
       <w:r>
         <w:rPr>
-          <w:rFonts w:ascii="Noto Sans" w:hAnsi="Noto Sans" w:eastAsia="Noto Sans" w:cs="Noto Sans"/>
+          <w:rFonts w:ascii="Noto Sans" w:hAnsi="Noto Sans" w:cs="Noto Sans" w:eastAsia="Noto Sans CJK SC"/>
           <w:b/>
           <w:color w:val="111111"/>
           <w:sz w:val="17"/>
         </w:rPr>
-        <w:t xml:space="preserve">关键词 </w:t>
+        <w:t>关键词</w:t>
       </w:r>
       <w:r>
-        <w:t>[关键词 1；关键词 2；关键词 3]</w:t>
+        <w:t xml:space="preserve">　篠泽广；学园偶像大师；HIRO2026；AtelierTeX；ACGN；LaTeX</w:t>
+      </w:r>
+    </w:p>
+    <w:p>
+      <w:pPr>
+        <w:spacing w:after="113" w:line="20" w:lineRule="exact"/>
+      </w:pPr>
+    </w:p>
+    <w:p>
+      <w:r>
+        <w:br w:type="page"/>
       </w:r>
     </w:p>
     <w:p>
@@ -302,20 +289,12 @@
         <w:pStyle w:val="Heading1"/>
       </w:pPr>
       <w:r>
-        <w:t>一、[一级标题]</w:t>
+        <w:t>一、多语种与叙事环境</w:t>
       </w:r>
     </w:p>
     <w:p>
       <w:r>
-        <w:t>[正文从这里开始。Normal 样式对应 HIRO 正文：A4、27.5 mm 左右边距、10.35 pt 正文、16.1 pt 固定行距、首行约 2 em。]</w:t>
-      </w:r>
-    </w:p>
-    <w:p>
-      <w:pPr>
-        <w:pStyle w:val="Heading2"/>
-      </w:pPr>
-      <w:r>
-        <w:t>语义样式示例（可整体删除）</w:t>
+        <w:t>中文姓名“篠泽广”和日文姓名“篠澤 広”可以在同一篇长文中稳定排版。</w:t>
       </w:r>
     </w:p>
     <w:p>
@@ -323,7 +302,7 @@
         <w:pStyle w:val="HIROOriginal"/>
       </w:pPr>
       <w:r>
-        <w:t>HiroOriginal：日本語原文・繁体中文原文等。</w:t>
+        <w:t>篠澤 広――日本語組版の確認用テキスト。</w:t>
       </w:r>
     </w:p>
     <w:p>
@@ -331,22 +310,35 @@
         <w:pStyle w:val="HIROTranslation"/>
       </w:pPr>
       <w:r>
-        <w:t>HiroTranslation：对应译文。</w:t>
+        <w:t>篠泽广——用于检查中文译文排版的示例文本。</w:t>
       </w:r>
     </w:p>
     <w:p>
       <w:pPr>
         <w:pStyle w:val="HIROSceneLabel"/>
+        <w:pBdr>
+          <w:bottom w:val="single" w:sz="2" w:space="0" w:color="C6C6C0"/>
+        </w:pBdr>
         <w:tabs>
-          <w:tab w:val="right" w:pos="5000"/>
+          <w:tab w:val="right" w:pos="7600"/>
         </w:tabs>
       </w:pPr>
       <w:r>
+        <w:rPr>
+          <w:rFonts w:ascii="Noto Sans" w:hAnsi="Noto Sans" w:cs="Noto Sans" w:eastAsia="Noto Sans CJK SC"/>
+          <w:color w:val="969691"/>
+          <w:sz w:val="13"/>
+        </w:rPr>
         <w:t>SCENE</w:t>
       </w:r>
       <w:r>
+        <w:rPr>
+          <w:rFonts w:ascii="Noto Sans" w:hAnsi="Noto Sans" w:cs="Noto Sans" w:eastAsia="Noto Sans CJK SC"/>
+          <w:color w:val="969691"/>
+          <w:sz w:val="13"/>
+        </w:rPr>
         <w:tab/>
-        <w:t>[LOCATOR]</w:t>
+        <w:t>DEMO / SCENE 01</w:t>
       </w:r>
     </w:p>
     <w:p>
@@ -354,7 +346,7 @@
         <w:pStyle w:val="HIROSceneTitle"/>
       </w:pPr>
       <w:r>
-        <w:t>[场景标题]</w:t>
+        <w:t>示例场景</w:t>
       </w:r>
     </w:p>
     <w:p>
@@ -362,7 +354,7 @@
         <w:pStyle w:val="HIROSceneBody"/>
       </w:pPr>
       <w:r>
-        <w:t>[场景化材料正文。]</w:t>
+        <w:t>场景环境用于组织剧情材料或场景化转述，section 继续承担文章的论证层级。</w:t>
       </w:r>
     </w:p>
     <w:p>
@@ -371,45 +363,161 @@
       </w:pPr>
       <w:r>
         <w:rPr>
-          <w:rFonts w:ascii="Noto Sans" w:hAnsi="Noto Sans" w:eastAsia="Noto Sans" w:cs="Noto Sans"/>
+          <w:rFonts w:ascii="Noto Sans" w:hAnsi="Noto Sans" w:cs="Noto Sans" w:eastAsia="Noto Sans CJK SC"/>
           <w:b/>
           <w:color w:val="969691"/>
           <w:sz w:val="16"/>
         </w:rPr>
-        <w:t xml:space="preserve">[角色 A] </w:t>
+        <w:t>角色 A</w:t>
       </w:r>
       <w:r>
-        <w:t>[对白或分析文本。]</w:t>
+        <w:t xml:space="preserve">　这里展示对话环境的第一段文本。</w:t>
       </w:r>
     </w:p>
     <w:p>
       <w:pPr>
-        <w:pStyle w:val="HIROPullQuote"/>
+        <w:pStyle w:val="HIRODialogue"/>
       </w:pPr>
       <w:r>
-        <w:t>[强调引文 / Pull Quote]</w:t>
+        <w:rPr>
+          <w:rFonts w:ascii="Noto Sans" w:hAnsi="Noto Sans" w:cs="Noto Sans" w:eastAsia="Noto Sans CJK SC"/>
+          <w:b/>
+          <w:color w:val="969691"/>
+          <w:sz w:val="16"/>
+        </w:rPr>
+        <w:t>角色 B</w:t>
+      </w:r>
+      <w:r>
+        <w:t xml:space="preserve">　作者可以把角色对白与分析正文放在不同的视觉层级中。</w:t>
       </w:r>
     </w:p>
     <w:p>
       <w:pPr>
-        <w:pStyle w:val="HIRONoteLabel"/>
+        <w:pStyle w:val="Heading1"/>
       </w:pPr>
       <w:r>
-        <w:t>按 / NOTE</w:t>
+        <w:t>二、跨媒介参考文献</w:t>
+      </w:r>
+    </w:p>
+    <w:p>
+      <w:r>
+        <w:t>本节使用公开官方元数据展示 GAME、CHARACTER FILE、COMM 与 MUSIC。正式著录由 GB/T 7714 体系承担，HIRO2026 profile 负责专题视觉与 media tag 呈现。</w:t>
+      </w:r>
+    </w:p>
+    <w:p>
+      <w:r>
+        <w:t>游戏本体可以直接引用为《学園アイドルマスター》[1]，角色资料引用篠澤広官方档案[2]。作品内部剧情节点使用 postnote 保存精确 Locator，例如：</w:t>
       </w:r>
     </w:p>
     <w:p>
       <w:pPr>
-        <w:pStyle w:val="HIRONote"/>
+        <w:pStyle w:val="HIROCode"/>
       </w:pPr>
       <w:r>
-        <w:t>[注记正文。]</w:t>
+        <w:t>\\cite[STEP1 / Episode 8]{hiro_commu_step1_08}</w:t>
+      </w:r>
+    </w:p>
+    <w:p>
+      <w:r>
+        <w:t>实际渲染为剧情节点[3]。音乐材料可以并引官方曲目页与实体单曲页[4–5]。</w:t>
+      </w:r>
+    </w:p>
+    <w:p>
+      <w:pPr>
+        <w:spacing w:before="80"/>
+        <w:pBdr>
+          <w:bottom w:val="single" w:sz="3" w:space="0" w:color="C6C6C0"/>
+        </w:pBdr>
+      </w:pPr>
+    </w:p>
+    <w:p>
+      <w:pPr>
+        <w:spacing w:after="40"/>
+      </w:pPr>
+      <w:r>
+        <w:rPr>
+          <w:rFonts w:ascii="Noto Sans" w:hAnsi="Noto Sans" w:cs="Noto Sans" w:eastAsia="Noto Sans CJK SC"/>
+          <w:b/>
+          <w:color w:val="969691"/>
+          <w:sz w:val="13"/>
+        </w:rPr>
+        <w:t>ATX-ACGN-REF 0.4 / GB/T 7714</w:t>
+      </w:r>
+    </w:p>
+    <w:p>
+      <w:pPr>
+        <w:pStyle w:val="HIROReference"/>
+      </w:pPr>
+      <w:r>
+        <w:t>GAME  游戏本体　 COMM · STEP4/EP37  游戏剧情　 ANIME · EP01  动画单集　 MANGA · CH01  漫画单话</w:t>
+      </w:r>
+    </w:p>
+    <w:p>
+      <w:pPr>
+        <w:pStyle w:val="HIROReference"/>
+      </w:pPr>
+      <w:r>
+        <w:t>MUSIC  音乐　 LIVE  演出　 FAN LOCATOR  定位资料</w:t>
+      </w:r>
+    </w:p>
+    <w:p>
+      <w:pPr>
+        <w:pBdr>
+          <w:bottom w:val="single" w:sz="3" w:space="0" w:color="C6C6C0"/>
+        </w:pBdr>
+      </w:pPr>
+    </w:p>
+    <w:p>
+      <w:pPr>
+        <w:pStyle w:val="Heading1"/>
+      </w:pPr>
+      <w:r>
+        <w:t>参考文献</w:t>
+      </w:r>
+    </w:p>
+    <w:p>
+      <w:pPr>
+        <w:pStyle w:val="HIROReference"/>
+      </w:pPr>
+      <w:r>
+        <w:t>[1] Bandai Namco Entertainment Inc. 学園アイドルマスター [GAME]. 2024.</w:t>
+      </w:r>
+    </w:p>
+    <w:p>
+      <w:pPr>
+        <w:pStyle w:val="HIROReference"/>
+      </w:pPr>
+      <w:r>
+        <w:t>[2] 学園アイドルマスター. 篠澤 広 CHARACTER FILE [CHARACTER FILE].</w:t>
+      </w:r>
+    </w:p>
+    <w:p>
+      <w:pPr>
+        <w:pStyle w:val="HIROReference"/>
+      </w:pPr>
+      <w:r>
+        <w:t>[3] 学園アイドルマスター. STEP1 / Episode 8 [COMM].</w:t>
+      </w:r>
+    </w:p>
+    <w:p>
+      <w:pPr>
+        <w:pStyle w:val="HIROReference"/>
+      </w:pPr>
+      <w:r>
+        <w:t>[4] 学園アイドルマスター. 光景 [MUSIC].</w:t>
+      </w:r>
+    </w:p>
+    <w:p>
+      <w:pPr>
+        <w:pStyle w:val="HIROReference"/>
+      </w:pPr>
+      <w:r>
+        <w:t>[5] 篠澤 広 1st Single [MUSIC].</w:t>
       </w:r>
     </w:p>
     <w:sectPr>
       <w:headerReference w:type="default" r:id="rId9"/>
       <w:footerReference w:type="default" r:id="rId10"/>
-      <w:footerReference w:type="first" r:id="rId11"/>
       <w:pgSz w:w="11906" w:h="16838"/>
       <w:pgMar w:top="1304" w:right="1559" w:bottom="1417" w:left="1559" w:header="397" w:footer="680" w:gutter="0"/>
       <w:cols w:space="720"/>
@@ -429,30 +537,9 @@
     </w:pPr>
     <w:r>
       <w:rPr>
-        <w:rFonts w:ascii="Noto Serif" w:hAnsi="Noto Serif" w:eastAsia="Noto Serif" w:cs="Noto Serif"/>
-        <w:color w:val="111111"/>
-        <w:sz w:val="18"/>
-      </w:rPr>
-      <w:fldChar w:fldCharType="begin"/>
-      <w:instrText xml:space="preserve"> PAGE </w:instrText>
-      <w:fldChar w:fldCharType="end"/>
-    </w:r>
-  </w:p>
-</w:ftr>
-</file>
-
-<file path=word/footer2.xml><?xml version="1.0" encoding="utf-8"?>
-<w:ftr xmlns:m="http://schemas.openxmlformats.org/officeDocument/2006/math" xmlns:mc="http://schemas.openxmlformats.org/markup-compatibility/2006" xmlns:mo="http://schemas.microsoft.com/office/mac/office/2008/main" xmlns:mv="urn:schemas-microsoft-com:mac:vml" xmlns:o="urn:schemas-microsoft-com:office:office" xmlns:r="http://schemas.openxmlformats.org/officeDocument/2006/relationships" xmlns:v="urn:schemas-microsoft-com:vml" xmlns:w10="urn:schemas-microsoft-com:office:word" xmlns:w14="http://schemas.microsoft.com/office/word/2010/wordml" xmlns:w="http://schemas.openxmlformats.org/wordprocessingml/2006/main" xmlns:wne="http://schemas.microsoft.com/office/word/2006/wordml" xmlns:wp14="http://schemas.microsoft.com/office/word/2010/wordprocessingDrawing" xmlns:wp="http://schemas.openxmlformats.org/drawingml/2006/wordprocessingDrawing" xmlns:wpc="http://schemas.microsoft.com/office/word/2010/wordprocessingCanvas" xmlns:wpg="http://schemas.microsoft.com/office/word/2010/wordprocessingGroup" xmlns:wpi="http://schemas.microsoft.com/office/word/2010/wordprocessingInk" xmlns:wps="http://schemas.microsoft.com/office/word/2010/wordprocessingShape" mc:Ignorable="w14 wp14">
-  <w:p>
-    <w:pPr>
-      <w:pStyle w:val="Footer"/>
-      <w:jc w:val="center"/>
-    </w:pPr>
-    <w:r>
-      <w:rPr>
-        <w:rFonts w:ascii="Noto Serif" w:hAnsi="Noto Serif" w:eastAsia="Noto Serif" w:cs="Noto Serif"/>
-        <w:color w:val="111111"/>
-        <w:sz w:val="18"/>
+        <w:rFonts w:ascii="Noto Serif" w:hAnsi="Noto Serif" w:cs="Noto Serif" w:eastAsia="Noto Serif CJK SC"/>
+        <w:color w:val="666662"/>
+        <w:sz w:val="14"/>
       </w:rPr>
       <w:fldChar w:fldCharType="begin"/>
       <w:instrText xml:space="preserve"> PAGE </w:instrText>
@@ -467,26 +554,27 @@
   <w:p>
     <w:pPr>
       <w:pStyle w:val="Header"/>
+      <w:spacing w:after="0"/>
       <w:tabs>
         <w:tab w:val="right" w:pos="8780"/>
       </w:tabs>
     </w:pPr>
     <w:r>
       <w:rPr>
-        <w:rFonts w:ascii="Noto Sans" w:hAnsi="Noto Sans" w:eastAsia="Noto Sans" w:cs="Noto Sans"/>
+        <w:rFonts w:ascii="Noto Sans" w:hAnsi="Noto Sans" w:cs="Noto Sans" w:eastAsia="Noto Sans CJK SC"/>
         <w:color w:val="969691"/>
         <w:sz w:val="13"/>
       </w:rPr>
-      <w:t>HIRO 2026  /  [PAPER TYPE]</w:t>
+      <w:t>HIRO 2026  /  第三方支援样张</w:t>
     </w:r>
     <w:r>
       <w:rPr>
-        <w:rFonts w:ascii="Noto Sans" w:hAnsi="Noto Sans" w:eastAsia="Noto Sans" w:cs="Noto Sans"/>
+        <w:rFonts w:ascii="Noto Sans" w:hAnsi="Noto Sans" w:cs="Noto Sans" w:eastAsia="Noto Sans CJK SC"/>
         <w:color w:val="969691"/>
-        <w:sz w:val="13"/>
+        <w:sz w:val="14"/>
       </w:rPr>
       <w:tab/>
-      <w:t>[SHORT TITLE]</w:t>
+      <w:t>HIRO2026 非官方支援模板</w:t>
     </w:r>
   </w:p>
 </w:hdr>
@@ -860,7 +948,7 @@
       <w:ind w:firstLine="414"/>
     </w:pPr>
     <w:rPr>
-      <w:rFonts w:ascii="Noto Serif" w:hAnsi="Noto Serif" w:eastAsia="Noto Serif" w:cs="Noto Serif"/>
+      <w:rFonts w:ascii="Noto Serif" w:hAnsi="Noto Serif" w:cs="Noto Serif" w:eastAsia="Noto Serif CJK SC"/>
       <w:color w:val="1D1D1B"/>
       <w:sz w:val="20"/>
     </w:rPr>
@@ -920,11 +1008,11 @@
     <w:pPr>
       <w:keepNext/>
       <w:keepLines/>
-      <w:spacing w:before="480" w:after="180"/>
+      <w:spacing w:before="480" w:after="180" w:line="400" w:lineRule="exact"/>
       <w:outlineLvl w:val="0"/>
     </w:pPr>
     <w:rPr>
-      <w:rFonts w:asciiTheme="majorHAnsi" w:eastAsiaTheme="majorEastAsia" w:hAnsiTheme="majorHAnsi" w:cstheme="majorBidi" w:ascii="Noto Sans" w:hAnsi="Noto Sans" w:eastAsia="Noto Sans" w:cs="Noto Sans"/>
+      <w:rFonts w:asciiTheme="majorHAnsi" w:eastAsiaTheme="majorEastAsia" w:hAnsiTheme="majorHAnsi" w:cstheme="majorBidi" w:ascii="Noto Sans" w:hAnsi="Noto Sans" w:cs="Noto Sans" w:eastAsia="Noto Sans CJK SC"/>
       <w:b/>
       <w:bCs/>
       <w:color w:val="111111"/>
@@ -944,11 +1032,11 @@
     <w:pPr>
       <w:keepNext/>
       <w:keepLines/>
-      <w:spacing w:before="320" w:after="120"/>
+      <w:spacing w:before="320" w:after="120" w:line="330" w:lineRule="exact"/>
       <w:outlineLvl w:val="1"/>
     </w:pPr>
     <w:rPr>
-      <w:rFonts w:asciiTheme="majorHAnsi" w:eastAsiaTheme="majorEastAsia" w:hAnsiTheme="majorHAnsi" w:cstheme="majorBidi" w:ascii="Noto Sans" w:hAnsi="Noto Sans" w:eastAsia="Noto Sans" w:cs="Noto Sans"/>
+      <w:rFonts w:asciiTheme="majorHAnsi" w:eastAsiaTheme="majorEastAsia" w:hAnsiTheme="majorHAnsi" w:cstheme="majorBidi" w:ascii="Noto Sans" w:hAnsi="Noto Sans" w:cs="Noto Sans" w:eastAsia="Noto Sans CJK SC"/>
       <w:b/>
       <w:bCs/>
       <w:color w:val="111111"/>
@@ -968,15 +1056,14 @@
     <w:pPr>
       <w:keepNext/>
       <w:keepLines/>
-      <w:spacing w:before="220" w:after="0"/>
+      <w:spacing w:before="200" w:after="0"/>
       <w:outlineLvl w:val="2"/>
     </w:pPr>
     <w:rPr>
-      <w:rFonts w:asciiTheme="majorHAnsi" w:eastAsiaTheme="majorEastAsia" w:hAnsiTheme="majorHAnsi" w:cstheme="majorBidi" w:ascii="Noto Sans" w:hAnsi="Noto Sans" w:eastAsia="Noto Sans" w:cs="Noto Sans"/>
+      <w:rFonts w:asciiTheme="majorHAnsi" w:eastAsiaTheme="majorEastAsia" w:hAnsiTheme="majorHAnsi" w:cstheme="majorBidi"/>
       <w:b/>
       <w:bCs/>
-      <w:color w:val="111111"/>
-      <w:sz w:val="20"/>
+      <w:color w:val="4F81BD" w:themeColor="accent1"/>
     </w:rPr>
   </w:style>
   <w:style w:type="paragraph" w:styleId="Heading4">
@@ -12548,272 +12635,324 @@
       </w:tcPr>
     </w:tblStylePr>
   </w:style>
-  <w:style w:type="paragraph" w:customStyle="1" w:styleId="HIROMasthead">
-    <w:name w:val="HIRO Masthead"/>
-    <w:pPr>
-      <w:spacing w:line="420" w:lineRule="exact"/>
-      <w:jc w:val="left"/>
+  <w:style w:type="paragraph" w:customStyle="1" w:styleId="ATFeatureKicker">
+    <w:name w:val="AT Feature Kicker"/>
+    <w:pPr>
+      <w:spacing w:before="0" w:after="220" w:line="220" w:lineRule="exact"/>
     </w:pPr>
     <w:rPr>
-      <w:rFonts w:ascii="Noto Sans" w:hAnsi="Noto Sans" w:eastAsia="Noto Sans" w:cs="Noto Sans"/>
+      <w:rFonts w:ascii="Noto Sans" w:hAnsi="Noto Sans" w:cs="Noto Sans" w:eastAsia="Noto Sans CJK SC"/>
       <w:b/>
-      <w:color w:val="111111"/>
-      <w:sz w:val="38"/>
+      <w:color w:val="334E68"/>
+      <w:sz w:val="18"/>
     </w:rPr>
   </w:style>
-  <w:style w:type="paragraph" w:customStyle="1" w:styleId="HIROPublicationMeta">
-    <w:name w:val="HIRO Publication Meta"/>
-    <w:pPr>
-      <w:spacing w:line="170" w:lineRule="exact"/>
+  <w:style w:type="paragraph" w:customStyle="1" w:styleId="ATFeatureTitle">
+    <w:name w:val="AT Feature Title"/>
+    <w:pPr>
+      <w:spacing w:before="0" w:after="0" w:line="500" w:lineRule="exact"/>
+    </w:pPr>
+    <w:rPr>
+      <w:rFonts w:ascii="Noto Serif" w:hAnsi="Noto Serif" w:cs="Noto Serif" w:eastAsia="Noto Serif CJK SC"/>
+      <w:b/>
+      <w:color w:val="202124"/>
+      <w:sz w:val="41"/>
+    </w:rPr>
+  </w:style>
+  <w:style w:type="paragraph" w:customStyle="1" w:styleId="ATFeatureSubtitle">
+    <w:name w:val="AT Feature Subtitle"/>
+    <w:pPr>
+      <w:spacing w:before="0" w:after="0" w:line="360" w:lineRule="exact"/>
+    </w:pPr>
+    <w:rPr>
+      <w:rFonts w:ascii="Noto Serif" w:hAnsi="Noto Serif" w:cs="Noto Serif" w:eastAsia="Noto Serif CJK SC"/>
+      <w:color w:val="666B73"/>
+      <w:sz w:val="28"/>
+    </w:rPr>
+  </w:style>
+  <w:style w:type="paragraph" w:customStyle="1" w:styleId="ATFeatureEnglish">
+    <w:name w:val="AT Feature English"/>
+    <w:pPr>
+      <w:spacing w:before="0" w:after="0" w:line="300" w:lineRule="exact"/>
+    </w:pPr>
+    <w:rPr>
+      <w:rFonts w:ascii="Noto Serif" w:hAnsi="Noto Serif" w:cs="Noto Serif" w:eastAsia="Noto Serif CJK SC"/>
+      <w:i/>
+      <w:color w:val="666B73"/>
+      <w:sz w:val="24"/>
+    </w:rPr>
+  </w:style>
+  <w:style w:type="paragraph" w:customStyle="1" w:styleId="ATFeatureAuthor">
+    <w:name w:val="AT Feature Author"/>
+    <w:pPr>
+      <w:spacing w:before="0" w:after="0" w:line="300" w:lineRule="exact"/>
+    </w:pPr>
+    <w:rPr>
+      <w:rFonts w:ascii="Noto Serif" w:hAnsi="Noto Serif" w:cs="Noto Serif" w:eastAsia="Noto Serif CJK SC"/>
+      <w:color w:val="202124"/>
+      <w:sz w:val="24"/>
+    </w:rPr>
+  </w:style>
+  <w:style w:type="paragraph" w:customStyle="1" w:styleId="ATFeatureAffiliation">
+    <w:name w:val="AT Feature Affiliation"/>
+    <w:pPr>
+      <w:spacing w:before="0" w:after="0" w:line="260" w:lineRule="exact"/>
+    </w:pPr>
+    <w:rPr>
+      <w:rFonts w:ascii="Noto Serif" w:hAnsi="Noto Serif" w:cs="Noto Serif" w:eastAsia="Noto Serif CJK SC"/>
+      <w:color w:val="666B73"/>
+      <w:sz w:val="20"/>
+    </w:rPr>
+  </w:style>
+  <w:style w:type="paragraph" w:customStyle="1" w:styleId="ATFeatureContact">
+    <w:name w:val="AT Feature Contact"/>
+    <w:pPr>
+      <w:spacing w:before="0" w:after="0" w:line="240" w:lineRule="exact"/>
+    </w:pPr>
+    <w:rPr>
+      <w:rFonts w:ascii="Noto Serif" w:hAnsi="Noto Serif" w:cs="Noto Serif" w:eastAsia="Noto Serif CJK SC"/>
+      <w:color w:val="666B73"/>
+      <w:sz w:val="18"/>
+    </w:rPr>
+  </w:style>
+  <w:style w:type="paragraph" w:customStyle="1" w:styleId="ATFeatureMeta">
+    <w:name w:val="AT Feature Meta"/>
+    <w:pPr>
+      <w:spacing w:before="0" w:after="0" w:line="240" w:lineRule="exact"/>
+    </w:pPr>
+    <w:rPr>
+      <w:rFonts w:ascii="Noto Serif" w:hAnsi="Noto Serif" w:cs="Noto Serif" w:eastAsia="Noto Serif CJK SC"/>
+      <w:color w:val="666B73"/>
+      <w:sz w:val="18"/>
+    </w:rPr>
+  </w:style>
+  <w:style w:type="paragraph" w:customStyle="1" w:styleId="ATFeatureNote">
+    <w:name w:val="AT Feature Note"/>
+    <w:pPr>
+      <w:spacing w:before="0" w:after="0" w:line="220" w:lineRule="exact"/>
+    </w:pPr>
+    <w:rPr>
+      <w:rFonts w:ascii="Noto Serif" w:hAnsi="Noto Serif" w:cs="Noto Serif" w:eastAsia="Noto Serif CJK SC"/>
+      <w:color w:val="666B73"/>
+      <w:sz w:val="16"/>
+    </w:rPr>
+  </w:style>
+  <w:style w:type="paragraph" w:customStyle="1" w:styleId="ATPubMeta">
+    <w:name w:val="AT Pub Meta"/>
+    <w:pPr>
+      <w:spacing w:before="0" w:after="0" w:line="170" w:lineRule="exact"/>
       <w:jc w:val="right"/>
     </w:pPr>
     <w:rPr>
-      <w:rFonts w:ascii="Noto Sans" w:hAnsi="Noto Sans" w:eastAsia="Noto Sans" w:cs="Noto Sans"/>
+      <w:rFonts w:ascii="Noto Sans" w:hAnsi="Noto Sans" w:cs="Noto Sans" w:eastAsia="Noto Sans CJK SC"/>
+      <w:color w:val="666B73"/>
+      <w:sz w:val="13"/>
+    </w:rPr>
+  </w:style>
+  <w:style w:type="paragraph" w:customStyle="1" w:styleId="ATKicker">
+    <w:name w:val="AT Kicker"/>
+    <w:pPr>
+      <w:spacing w:before="0" w:after="0" w:line="180" w:lineRule="exact"/>
+    </w:pPr>
+    <w:rPr>
+      <w:rFonts w:ascii="Noto Sans" w:hAnsi="Noto Sans" w:cs="Noto Sans" w:eastAsia="Noto Sans CJK SC"/>
+      <w:b/>
+      <w:color w:val="666B73"/>
+      <w:sz w:val="14"/>
+    </w:rPr>
+  </w:style>
+  <w:style w:type="paragraph" w:customStyle="1" w:styleId="ATTitle">
+    <w:name w:val="AT Title"/>
+    <w:pPr>
+      <w:spacing w:before="0" w:after="0" w:line="700" w:lineRule="exact"/>
+    </w:pPr>
+    <w:rPr>
+      <w:rFonts w:ascii="Noto Serif" w:hAnsi="Noto Serif" w:cs="Noto Serif" w:eastAsia="Noto Serif CJK SC"/>
+      <w:b/>
+      <w:color w:val="202124"/>
+      <w:sz w:val="54"/>
+    </w:rPr>
+  </w:style>
+  <w:style w:type="paragraph" w:customStyle="1" w:styleId="ATSubtitle">
+    <w:name w:val="AT Subtitle"/>
+    <w:pPr>
+      <w:spacing w:before="0" w:after="0" w:line="384" w:lineRule="exact"/>
+    </w:pPr>
+    <w:rPr>
+      <w:rFonts w:ascii="Noto Serif" w:hAnsi="Noto Serif" w:cs="Noto Serif" w:eastAsia="Noto Serif CJK SC"/>
+      <w:color w:val="202124"/>
+      <w:sz w:val="25"/>
+    </w:rPr>
+  </w:style>
+  <w:style w:type="paragraph" w:customStyle="1" w:styleId="ATEnglish">
+    <w:name w:val="AT English"/>
+    <w:pPr>
+      <w:spacing w:before="0" w:after="0" w:line="270" w:lineRule="exact"/>
+      <w:ind w:right="1049"/>
+    </w:pPr>
+    <w:rPr>
+      <w:rFonts w:ascii="Noto Serif" w:hAnsi="Noto Serif" w:cs="Noto Serif" w:eastAsia="Noto Serif CJK SC"/>
+      <w:i/>
+      <w:color w:val="666B73"/>
+      <w:sz w:val="19"/>
+    </w:rPr>
+  </w:style>
+  <w:style w:type="paragraph" w:customStyle="1" w:styleId="ATDeck">
+    <w:name w:val="AT Deck"/>
+    <w:pPr>
+      <w:spacing w:before="0" w:after="0" w:line="310" w:lineRule="exact"/>
+      <w:ind w:right="624"/>
+    </w:pPr>
+    <w:rPr>
+      <w:rFonts w:ascii="Noto Serif" w:hAnsi="Noto Serif" w:cs="Noto Serif" w:eastAsia="Noto Serif CJK SC"/>
+      <w:color w:val="666B73"/>
+      <w:sz w:val="19"/>
+    </w:rPr>
+  </w:style>
+  <w:style w:type="paragraph" w:customStyle="1" w:styleId="ATAuthor">
+    <w:name w:val="AT Author"/>
+    <w:pPr>
+      <w:spacing w:before="0" w:after="0" w:line="268" w:lineRule="exact"/>
+    </w:pPr>
+    <w:rPr>
+      <w:rFonts w:ascii="Noto Serif" w:hAnsi="Noto Serif" w:cs="Noto Serif" w:eastAsia="Noto Serif CJK SC"/>
+      <w:color w:val="202124"/>
+      <w:sz w:val="20"/>
+    </w:rPr>
+  </w:style>
+  <w:style w:type="paragraph" w:customStyle="1" w:styleId="ATEssayAuthor">
+    <w:name w:val="AT Essay Author"/>
+    <w:pPr>
+      <w:spacing w:before="0" w:after="0" w:line="264" w:lineRule="exact"/>
+    </w:pPr>
+    <w:rPr>
+      <w:rFonts w:ascii="Noto Serif" w:hAnsi="Noto Serif" w:cs="Noto Serif" w:eastAsia="Noto Serif CJK SC"/>
+      <w:color w:val="202124"/>
+      <w:sz w:val="19"/>
+    </w:rPr>
+  </w:style>
+  <w:style w:type="paragraph" w:customStyle="1" w:styleId="ATAffiliation">
+    <w:name w:val="AT Affiliation"/>
+    <w:pPr>
+      <w:spacing w:before="0" w:after="0" w:line="244" w:lineRule="exact"/>
+    </w:pPr>
+    <w:rPr>
+      <w:rFonts w:ascii="Noto Serif" w:hAnsi="Noto Serif" w:cs="Noto Serif" w:eastAsia="Noto Serif CJK SC"/>
+      <w:color w:val="666B73"/>
+      <w:sz w:val="17"/>
+    </w:rPr>
+  </w:style>
+  <w:style w:type="paragraph" w:customStyle="1" w:styleId="ATEssayAffiliation">
+    <w:name w:val="AT Essay Affiliation"/>
+    <w:pPr>
+      <w:spacing w:before="0" w:after="0" w:line="236" w:lineRule="exact"/>
+    </w:pPr>
+    <w:rPr>
+      <w:rFonts w:ascii="Noto Serif" w:hAnsi="Noto Serif" w:cs="Noto Serif" w:eastAsia="Noto Serif CJK SC"/>
+      <w:color w:val="666B73"/>
+      <w:sz w:val="17"/>
+    </w:rPr>
+  </w:style>
+  <w:style w:type="paragraph" w:customStyle="1" w:styleId="ATContact">
+    <w:name w:val="AT Contact"/>
+    <w:pPr>
+      <w:spacing w:before="0" w:after="0" w:line="232" w:lineRule="exact"/>
+    </w:pPr>
+    <w:rPr>
+      <w:rFonts w:ascii="Noto Serif" w:hAnsi="Noto Serif" w:cs="Noto Serif" w:eastAsia="Noto Serif CJK SC"/>
+      <w:color w:val="666B73"/>
+      <w:sz w:val="17"/>
+    </w:rPr>
+  </w:style>
+  <w:style w:type="paragraph" w:customStyle="1" w:styleId="ATDocumentMeta">
+    <w:name w:val="AT Document Meta"/>
+    <w:pPr>
+      <w:spacing w:before="0" w:after="0" w:line="172" w:lineRule="exact"/>
+      <w:jc w:val="right"/>
+    </w:pPr>
+    <w:rPr>
+      <w:rFonts w:ascii="Noto Sans" w:hAnsi="Noto Sans" w:cs="Noto Sans" w:eastAsia="Noto Sans CJK SC"/>
+      <w:color w:val="666B73"/>
+      <w:sz w:val="13"/>
+    </w:rPr>
+  </w:style>
+  <w:style w:type="paragraph" w:customStyle="1" w:styleId="ATNote">
+    <w:name w:val="AT Note"/>
+    <w:pPr>
+      <w:spacing w:before="0" w:after="0" w:line="210" w:lineRule="exact"/>
+    </w:pPr>
+    <w:rPr>
+      <w:rFonts w:ascii="Noto Serif" w:hAnsi="Noto Serif" w:cs="Noto Serif" w:eastAsia="Noto Serif CJK SC"/>
+      <w:color w:val="666B73"/>
+      <w:sz w:val="15"/>
+    </w:rPr>
+  </w:style>
+  <w:style w:type="paragraph" w:customStyle="1" w:styleId="HIROAbstract">
+    <w:name w:val="HIRO Abstract"/>
+    <w:pPr>
+      <w:spacing w:before="0" w:after="0" w:line="308" w:lineRule="exact"/>
+      <w:ind w:left="397" w:right="397"/>
+    </w:pPr>
+    <w:rPr>
+      <w:rFonts w:ascii="Noto Serif" w:hAnsi="Noto Serif" w:cs="Noto Serif" w:eastAsia="Noto Serif CJK SC"/>
+      <w:color w:val="1D1D1B"/>
+      <w:sz w:val="18"/>
+    </w:rPr>
+  </w:style>
+  <w:style w:type="paragraph" w:customStyle="1" w:styleId="HIROKeywords">
+    <w:name w:val="HIRO Keywords"/>
+    <w:pPr>
+      <w:spacing w:before="0" w:after="0" w:line="288" w:lineRule="exact"/>
+      <w:ind w:left="397" w:right="397"/>
+    </w:pPr>
+    <w:rPr>
+      <w:rFonts w:ascii="Noto Serif" w:hAnsi="Noto Serif" w:cs="Noto Serif" w:eastAsia="Noto Serif CJK SC"/>
+      <w:color w:val="1D1D1B"/>
+      <w:sz w:val="18"/>
+    </w:rPr>
+  </w:style>
+  <w:style w:type="paragraph" w:customStyle="1" w:styleId="HIROOriginal">
+    <w:name w:val="HIRO Original"/>
+    <w:pPr>
+      <w:spacing w:before="80" w:after="40" w:line="304" w:lineRule="exact"/>
+      <w:ind w:left="454" w:right="454"/>
+    </w:pPr>
+    <w:rPr>
+      <w:rFonts w:ascii="Noto Serif" w:hAnsi="Noto Serif" w:cs="Noto Serif" w:eastAsia="Noto Serif CJK JP"/>
+      <w:color w:val="666662"/>
+      <w:sz w:val="19"/>
+    </w:rPr>
+  </w:style>
+  <w:style w:type="paragraph" w:customStyle="1" w:styleId="HIROTranslation">
+    <w:name w:val="HIRO Translation"/>
+    <w:pPr>
+      <w:spacing w:before="0" w:after="100" w:line="286" w:lineRule="exact"/>
+      <w:ind w:left="454" w:right="454"/>
+    </w:pPr>
+    <w:rPr>
+      <w:rFonts w:ascii="Noto Serif" w:hAnsi="Noto Serif" w:cs="Noto Serif" w:eastAsia="Noto Serif CJK SC"/>
+      <w:color w:val="969691"/>
+      <w:sz w:val="17"/>
+    </w:rPr>
+  </w:style>
+  <w:style w:type="paragraph" w:customStyle="1" w:styleId="HIROSceneLabel">
+    <w:name w:val="HIRO Scene Label"/>
+    <w:pPr>
+      <w:spacing w:before="280" w:after="40" w:line="160" w:lineRule="exact"/>
+    </w:pPr>
+    <w:rPr>
+      <w:rFonts w:ascii="Noto Sans" w:hAnsi="Noto Sans" w:cs="Noto Sans" w:eastAsia="Noto Sans CJK SC"/>
       <w:color w:val="969691"/>
       <w:sz w:val="13"/>
     </w:rPr>
   </w:style>
-  <w:style w:type="paragraph" w:customStyle="1" w:styleId="HIROKicker">
-    <w:name w:val="HIRO Kicker"/>
-    <w:pPr>
-      <w:spacing w:line="180" w:lineRule="exact"/>
-    </w:pPr>
-    <w:rPr>
-      <w:rFonts w:ascii="Noto Sans" w:hAnsi="Noto Sans" w:eastAsia="Noto Sans" w:cs="Noto Sans"/>
-      <w:b/>
-      <w:color w:val="666662"/>
-      <w:sz w:val="14"/>
-    </w:rPr>
-  </w:style>
-  <w:style w:type="paragraph" w:customStyle="1" w:styleId="HIROTitleFeature">
-    <w:name w:val="HIRO Title Feature"/>
-    <w:pPr>
-      <w:spacing w:line="660" w:lineRule="exact"/>
-    </w:pPr>
-    <w:rPr>
-      <w:rFonts w:ascii="Noto Serif" w:hAnsi="Noto Serif" w:eastAsia="Noto Serif" w:cs="Noto Serif"/>
-      <w:b/>
-      <w:color w:val="111111"/>
-      <w:sz w:val="52"/>
-    </w:rPr>
-  </w:style>
-  <w:style w:type="paragraph" w:customStyle="1" w:styleId="HIROTitle">
-    <w:name w:val="HIRO Title"/>
-    <w:pPr>
-      <w:spacing w:line="700" w:lineRule="exact"/>
-    </w:pPr>
-    <w:rPr>
-      <w:rFonts w:ascii="Noto Serif" w:hAnsi="Noto Serif" w:eastAsia="Noto Serif" w:cs="Noto Serif"/>
-      <w:b/>
-      <w:color w:val="111111"/>
-      <w:sz w:val="54"/>
-    </w:rPr>
-  </w:style>
-  <w:style w:type="paragraph" w:customStyle="1" w:styleId="HIROSubtitle">
-    <w:name w:val="HIRO Subtitle"/>
-    <w:pPr>
-      <w:spacing w:line="384" w:lineRule="exact"/>
-    </w:pPr>
-    <w:rPr>
-      <w:rFonts w:ascii="Noto Serif" w:hAnsi="Noto Serif" w:eastAsia="Noto Serif" w:cs="Noto Serif"/>
-      <w:color w:val="111111"/>
-      <w:sz w:val="25"/>
-    </w:rPr>
-  </w:style>
-  <w:style w:type="paragraph" w:customStyle="1" w:styleId="HIROEnglishTitle">
-    <w:name w:val="HIRO English Title"/>
-    <w:pPr>
-      <w:spacing w:line="270" w:lineRule="exact"/>
-    </w:pPr>
-    <w:rPr>
-      <w:rFonts w:ascii="Noto Serif" w:hAnsi="Noto Serif" w:eastAsia="Noto Serif" w:cs="Noto Serif"/>
-      <w:i/>
-      <w:color w:val="666662"/>
-      <w:sz w:val="19"/>
-    </w:rPr>
-  </w:style>
-  <w:style w:type="paragraph" w:customStyle="1" w:styleId="HIRODeck">
-    <w:name w:val="HIRO Deck"/>
-    <w:pPr>
-      <w:spacing w:line="310" w:lineRule="exact"/>
-      <w:ind w:right="624"/>
-    </w:pPr>
-    <w:rPr>
-      <w:rFonts w:ascii="Noto Serif" w:hAnsi="Noto Serif" w:eastAsia="Noto Serif" w:cs="Noto Serif"/>
-      <w:color w:val="666662"/>
-      <w:sz w:val="19"/>
-    </w:rPr>
-  </w:style>
-  <w:style w:type="paragraph" w:customStyle="1" w:styleId="HIROAuthor">
-    <w:name w:val="HIRO Author"/>
-    <w:pPr>
-      <w:spacing w:line="268" w:lineRule="exact"/>
-    </w:pPr>
-    <w:rPr>
-      <w:rFonts w:ascii="Noto Serif" w:hAnsi="Noto Serif" w:eastAsia="Noto Serif" w:cs="Noto Serif"/>
-      <w:color w:val="111111"/>
-      <w:sz w:val="20"/>
-    </w:rPr>
-  </w:style>
-  <w:style w:type="paragraph" w:customStyle="1" w:styleId="HIROAffiliation">
-    <w:name w:val="HIRO Affiliation"/>
-    <w:pPr>
-      <w:spacing w:line="244" w:lineRule="exact"/>
-    </w:pPr>
-    <w:rPr>
-      <w:rFonts w:ascii="Noto Serif" w:hAnsi="Noto Serif" w:eastAsia="Noto Serif" w:cs="Noto Serif"/>
-      <w:color w:val="666662"/>
-      <w:sz w:val="17"/>
-    </w:rPr>
-  </w:style>
-  <w:style w:type="paragraph" w:customStyle="1" w:styleId="HIROContact">
-    <w:name w:val="HIRO Contact"/>
-    <w:pPr>
-      <w:spacing w:line="232" w:lineRule="exact"/>
-    </w:pPr>
-    <w:rPr>
-      <w:rFonts w:ascii="Noto Serif" w:hAnsi="Noto Serif" w:eastAsia="Noto Serif" w:cs="Noto Serif"/>
-      <w:color w:val="666662"/>
-      <w:sz w:val="17"/>
-    </w:rPr>
-  </w:style>
-  <w:style w:type="paragraph" w:customStyle="1" w:styleId="HIRODocumentMeta">
-    <w:name w:val="HIRO Document Meta"/>
-    <w:pPr>
-      <w:spacing w:line="172" w:lineRule="exact"/>
-      <w:jc w:val="right"/>
-    </w:pPr>
-    <w:rPr>
-      <w:rFonts w:ascii="Noto Sans" w:hAnsi="Noto Sans" w:eastAsia="Noto Sans" w:cs="Noto Sans"/>
-      <w:color w:val="666662"/>
-      <w:sz w:val="13"/>
-    </w:rPr>
-  </w:style>
-  <w:style w:type="paragraph" w:customStyle="1" w:styleId="HIROAuthorNote">
-    <w:name w:val="HIRO Author Note"/>
-    <w:pPr>
-      <w:spacing w:line="210" w:lineRule="exact"/>
-    </w:pPr>
-    <w:rPr>
-      <w:rFonts w:ascii="Noto Serif" w:hAnsi="Noto Serif" w:eastAsia="Noto Serif" w:cs="Noto Serif"/>
-      <w:color w:val="666662"/>
-      <w:sz w:val="15"/>
-    </w:rPr>
-  </w:style>
-  <w:style w:type="paragraph" w:customStyle="1" w:styleId="HIROAbstract">
-    <w:name w:val="HIRO Abstract"/>
-    <w:pPr>
-      <w:spacing w:line="308" w:lineRule="exact"/>
-      <w:ind w:left="397" w:right="397"/>
-    </w:pPr>
-    <w:rPr>
-      <w:rFonts w:ascii="Noto Serif" w:hAnsi="Noto Serif" w:eastAsia="Noto Serif" w:cs="Noto Serif"/>
-      <w:color w:val="1D1D1B"/>
-      <w:sz w:val="18"/>
-    </w:rPr>
-  </w:style>
-  <w:style w:type="paragraph" w:customStyle="1" w:styleId="HIROKeywords">
-    <w:name w:val="HIRO Keywords"/>
-    <w:pPr>
-      <w:spacing w:line="288" w:lineRule="exact"/>
-      <w:ind w:left="397" w:right="397"/>
-    </w:pPr>
-    <w:rPr>
-      <w:rFonts w:ascii="Noto Serif" w:hAnsi="Noto Serif" w:eastAsia="Noto Serif" w:cs="Noto Serif"/>
-      <w:color w:val="1D1D1B"/>
-      <w:sz w:val="18"/>
-    </w:rPr>
-  </w:style>
-  <w:style w:type="paragraph" w:customStyle="1" w:styleId="HIROQuote">
-    <w:name w:val="HIRO Quote"/>
-    <w:pPr>
-      <w:spacing w:before="120" w:after="100" w:line="324" w:lineRule="exact"/>
-      <w:ind w:left="510" w:right="510"/>
-    </w:pPr>
-    <w:rPr>
-      <w:rFonts w:ascii="Noto Serif" w:hAnsi="Noto Serif" w:eastAsia="Noto Serif" w:cs="Noto Serif"/>
-      <w:color w:val="666662"/>
-      <w:sz w:val="20"/>
-    </w:rPr>
-  </w:style>
-  <w:style w:type="paragraph" w:customStyle="1" w:styleId="HIROQuoteSource">
-    <w:name w:val="HIRO Quote Source"/>
-    <w:pPr>
-      <w:spacing w:before="60" w:after="100" w:line="216" w:lineRule="exact"/>
-      <w:ind w:left="510" w:right="510"/>
-      <w:jc w:val="right"/>
-    </w:pPr>
-    <w:rPr>
-      <w:rFonts w:ascii="Noto Serif" w:hAnsi="Noto Serif" w:eastAsia="Noto Serif" w:cs="Noto Serif"/>
-      <w:color w:val="969691"/>
-      <w:sz w:val="16"/>
-    </w:rPr>
-  </w:style>
-  <w:style w:type="paragraph" w:customStyle="1" w:styleId="HIROPullQuote">
-    <w:name w:val="HIRO Pull Quote"/>
-    <w:pPr>
-      <w:spacing w:before="220" w:after="220" w:line="460" w:lineRule="exact"/>
-      <w:ind w:left="680" w:right="680"/>
-      <w:jc w:val="center"/>
-    </w:pPr>
-    <w:rPr>
-      <w:rFonts w:ascii="Noto Serif" w:hAnsi="Noto Serif" w:eastAsia="Noto Serif" w:cs="Noto Serif"/>
-      <w:color w:val="111111"/>
-      <w:sz w:val="30"/>
-    </w:rPr>
-  </w:style>
-  <w:style w:type="paragraph" w:customStyle="1" w:styleId="HIRONoteLabel">
-    <w:name w:val="HIRO Note Label"/>
-    <w:pPr>
-      <w:spacing w:after="40" w:line="160" w:lineRule="exact"/>
-    </w:pPr>
-    <w:rPr>
-      <w:rFonts w:ascii="Noto Sans" w:hAnsi="Noto Sans" w:eastAsia="Noto Sans" w:cs="Noto Sans"/>
-      <w:b/>
-      <w:color w:val="969691"/>
-      <w:sz w:val="13"/>
-    </w:rPr>
-  </w:style>
-  <w:style w:type="paragraph" w:customStyle="1" w:styleId="HIRONote">
-    <w:name w:val="HIRO Note"/>
-    <w:pPr>
-      <w:spacing w:after="160" w:line="292" w:lineRule="exact"/>
-    </w:pPr>
-    <w:rPr>
-      <w:rFonts w:ascii="Noto Serif" w:hAnsi="Noto Serif" w:eastAsia="Noto Serif" w:cs="Noto Serif"/>
-      <w:color w:val="1D1D1B"/>
-      <w:sz w:val="18"/>
-    </w:rPr>
-  </w:style>
-  <w:style w:type="paragraph" w:customStyle="1" w:styleId="HIROKey">
-    <w:name w:val="HIRO Key"/>
-    <w:pPr>
-      <w:spacing w:before="60" w:after="60" w:line="296" w:lineRule="exact"/>
-    </w:pPr>
-    <w:rPr>
-      <w:rFonts w:ascii="Noto Serif" w:hAnsi="Noto Serif" w:eastAsia="Noto Serif" w:cs="Noto Serif"/>
-      <w:color w:val="1D1D1B"/>
-      <w:sz w:val="19"/>
-    </w:rPr>
-  </w:style>
-  <w:style w:type="paragraph" w:customStyle="1" w:styleId="HIROSceneLabel">
-    <w:name w:val="HIRO Scene Label"/>
-    <w:pPr>
-      <w:spacing w:before="280" w:after="40" w:line="160" w:lineRule="exact"/>
-    </w:pPr>
-    <w:rPr>
-      <w:rFonts w:ascii="Noto Sans" w:hAnsi="Noto Sans" w:eastAsia="Noto Sans" w:cs="Noto Sans"/>
-      <w:color w:val="969691"/>
-      <w:sz w:val="13"/>
-    </w:rPr>
-  </w:style>
   <w:style w:type="paragraph" w:customStyle="1" w:styleId="HIROSceneTitle">
     <w:name w:val="HIRO Scene Title"/>
     <w:pPr>
-      <w:spacing w:after="100" w:line="360" w:lineRule="exact"/>
+      <w:spacing w:before="0" w:after="100" w:line="360" w:lineRule="exact"/>
     </w:pPr>
     <w:rPr>
-      <w:rFonts w:ascii="Noto Serif" w:hAnsi="Noto Serif" w:eastAsia="Noto Serif" w:cs="Noto Serif"/>
+      <w:rFonts w:ascii="Noto Serif" w:hAnsi="Noto Serif" w:cs="Noto Serif" w:eastAsia="Noto Serif CJK SC"/>
       <w:b/>
       <w:color w:val="111111"/>
       <w:sz w:val="24"/>
@@ -12822,157 +12961,46 @@
   <w:style w:type="paragraph" w:customStyle="1" w:styleId="HIROSceneBody">
     <w:name w:val="HIRO Scene Body"/>
     <w:pPr>
-      <w:spacing w:line="314" w:lineRule="exact"/>
-      <w:ind w:left="283" w:right="283" w:firstLine="397"/>
+      <w:spacing w:before="0" w:after="160" w:line="314" w:lineRule="exact"/>
+      <w:ind w:left="283" w:right="283" w:firstLine="414"/>
     </w:pPr>
     <w:rPr>
-      <w:rFonts w:ascii="Noto Serif" w:hAnsi="Noto Serif" w:eastAsia="Noto Serif" w:cs="Noto Serif"/>
+      <w:rFonts w:ascii="Noto Serif" w:hAnsi="Noto Serif" w:cs="Noto Serif" w:eastAsia="Noto Serif CJK SC"/>
       <w:color w:val="1D1D1B"/>
       <w:sz w:val="19"/>
     </w:rPr>
   </w:style>
-  <w:style w:type="paragraph" w:customStyle="1" w:styleId="HIROInterludeLabel">
-    <w:name w:val="HIRO Interlude Label"/>
-    <w:pPr>
-      <w:spacing w:after="100" w:line="160" w:lineRule="exact"/>
-      <w:jc w:val="center"/>
-    </w:pPr>
-    <w:rPr>
-      <w:rFonts w:ascii="Noto Sans" w:hAnsi="Noto Sans" w:eastAsia="Noto Sans" w:cs="Noto Sans"/>
-      <w:color w:val="969691"/>
-      <w:sz w:val="13"/>
-    </w:rPr>
-  </w:style>
-  <w:style w:type="paragraph" w:customStyle="1" w:styleId="HIROInterludeTitle">
-    <w:name w:val="HIRO Interlude Title"/>
-    <w:pPr>
-      <w:spacing w:after="140" w:line="540" w:lineRule="exact"/>
-      <w:jc w:val="center"/>
-    </w:pPr>
-    <w:rPr>
-      <w:rFonts w:ascii="Noto Serif" w:hAnsi="Noto Serif" w:eastAsia="Noto Serif" w:cs="Noto Serif"/>
-      <w:b/>
-      <w:color w:val="111111"/>
-      <w:sz w:val="36"/>
-    </w:rPr>
-  </w:style>
-  <w:style w:type="paragraph" w:customStyle="1" w:styleId="HIROInterludeBody">
-    <w:name w:val="HIRO Interlude Body"/>
-    <w:pPr>
-      <w:spacing w:line="340" w:lineRule="exact"/>
-      <w:ind w:left="1134" w:right="1134" w:firstLine="397"/>
-    </w:pPr>
-    <w:rPr>
-      <w:rFonts w:ascii="Noto Serif" w:hAnsi="Noto Serif" w:eastAsia="Noto Serif" w:cs="Noto Serif"/>
-      <w:color w:val="1D1D1B"/>
-      <w:sz w:val="20"/>
-    </w:rPr>
-  </w:style>
-  <w:style w:type="paragraph" w:customStyle="1" w:styleId="HIROEpigraph">
-    <w:name w:val="HIRO Epigraph"/>
-    <w:pPr>
-      <w:spacing w:before="200" w:after="60" w:line="320" w:lineRule="exact"/>
-      <w:ind w:left="1020" w:right="454"/>
-      <w:jc w:val="right"/>
-    </w:pPr>
-    <w:rPr>
-      <w:rFonts w:ascii="Noto Serif" w:hAnsi="Noto Serif" w:eastAsia="Noto Serif" w:cs="Noto Serif"/>
-      <w:i/>
-      <w:color w:val="666662"/>
-      <w:sz w:val="20"/>
-    </w:rPr>
-  </w:style>
-  <w:style w:type="paragraph" w:customStyle="1" w:styleId="HIROEpigraphSource">
-    <w:name w:val="HIRO Epigraph Source"/>
-    <w:pPr>
-      <w:spacing w:after="160" w:line="210" w:lineRule="exact"/>
-      <w:ind w:left="1020" w:right="454"/>
-      <w:jc w:val="right"/>
-    </w:pPr>
-    <w:rPr>
-      <w:rFonts w:ascii="Noto Serif" w:hAnsi="Noto Serif" w:eastAsia="Noto Serif" w:cs="Noto Serif"/>
-      <w:color w:val="666662"/>
-      <w:sz w:val="16"/>
-    </w:rPr>
-  </w:style>
   <w:style w:type="paragraph" w:customStyle="1" w:styleId="HIRODialogue">
     <w:name w:val="HIRO Dialogue"/>
     <w:pPr>
-      <w:spacing w:after="100" w:line="310" w:lineRule="exact"/>
+      <w:spacing w:before="0" w:after="100" w:line="310" w:lineRule="exact"/>
       <w:ind w:left="454" w:right="454"/>
     </w:pPr>
     <w:rPr>
-      <w:rFonts w:ascii="Noto Serif" w:hAnsi="Noto Serif" w:eastAsia="Noto Serif" w:cs="Noto Serif"/>
+      <w:rFonts w:ascii="Noto Serif" w:hAnsi="Noto Serif" w:cs="Noto Serif" w:eastAsia="Noto Serif CJK SC"/>
       <w:color w:val="1D1D1B"/>
       <w:sz w:val="19"/>
     </w:rPr>
   </w:style>
-  <w:style w:type="paragraph" w:customStyle="1" w:styleId="HIROSceneBreak">
-    <w:name w:val="HIRO Scene Break"/>
-    <w:pPr>
-      <w:spacing w:before="180" w:after="180"/>
-      <w:jc w:val="center"/>
+  <w:style w:type="paragraph" w:customStyle="1" w:styleId="HIROCode">
+    <w:name w:val="HIRO Code"/>
+    <w:pPr>
+      <w:spacing w:before="80" w:after="80" w:line="240" w:lineRule="exact"/>
+      <w:ind w:left="283" w:right="283"/>
     </w:pPr>
     <w:rPr>
-      <w:rFonts w:ascii="Noto Sans" w:hAnsi="Noto Sans" w:eastAsia="Noto Sans" w:cs="Noto Sans"/>
-      <w:color w:val="C6C6C0"/>
-      <w:sz w:val="20"/>
-    </w:rPr>
-  </w:style>
-  <w:style w:type="paragraph" w:customStyle="1" w:styleId="HIROCoda">
-    <w:name w:val="HIRO Coda"/>
-    <w:pPr>
-      <w:spacing w:before="320" w:after="200" w:line="350" w:lineRule="exact"/>
-      <w:ind w:left="567" w:right="567" w:firstLine="397"/>
-    </w:pPr>
-    <w:rPr>
-      <w:rFonts w:ascii="Noto Serif" w:hAnsi="Noto Serif" w:eastAsia="Noto Serif" w:cs="Noto Serif"/>
+      <w:rFonts w:ascii="DejaVu Sans Mono" w:hAnsi="DejaVu Sans Mono" w:cs="DejaVu Sans Mono" w:eastAsia="Noto Sans Mono CJK SC"/>
       <w:color w:val="1D1D1B"/>
-      <w:sz w:val="21"/>
-    </w:rPr>
-  </w:style>
-  <w:style w:type="paragraph" w:customStyle="1" w:styleId="HIROOriginal">
-    <w:name w:val="HIRO Original"/>
-    <w:pPr>
-      <w:spacing w:before="80" w:after="40" w:line="304" w:lineRule="exact"/>
-      <w:ind w:left="454" w:right="454"/>
-    </w:pPr>
-    <w:rPr>
-      <w:rFonts w:ascii="Noto Serif" w:hAnsi="Noto Serif" w:eastAsia="Noto Serif" w:cs="Noto Serif"/>
-      <w:color w:val="666662"/>
-      <w:sz w:val="19"/>
-    </w:rPr>
-  </w:style>
-  <w:style w:type="paragraph" w:customStyle="1" w:styleId="HIROTranslation">
-    <w:name w:val="HIRO Translation"/>
-    <w:pPr>
-      <w:spacing w:after="100" w:line="286" w:lineRule="exact"/>
-      <w:ind w:left="454" w:right="454"/>
-    </w:pPr>
-    <w:rPr>
-      <w:rFonts w:ascii="Noto Serif" w:hAnsi="Noto Serif" w:eastAsia="Noto Serif" w:cs="Noto Serif"/>
-      <w:color w:val="969691"/>
       <w:sz w:val="17"/>
     </w:rPr>
   </w:style>
-  <w:style w:type="paragraph" w:customStyle="1" w:styleId="HIROFigureSource">
-    <w:name w:val="HIRO Figure Source"/>
-    <w:pPr>
-      <w:spacing w:before="40" w:line="204" w:lineRule="exact"/>
-    </w:pPr>
-    <w:rPr>
-      <w:rFonts w:ascii="Noto Serif" w:hAnsi="Noto Serif" w:eastAsia="Noto Serif" w:cs="Noto Serif"/>
-      <w:color w:val="969691"/>
-      <w:sz w:val="15"/>
-    </w:rPr>
-  </w:style>
   <w:style w:type="paragraph" w:customStyle="1" w:styleId="HIROReference">
     <w:name w:val="HIRO Reference"/>
     <w:pPr>
-      <w:spacing w:after="72" w:line="251" w:lineRule="exact"/>
+      <w:spacing w:before="0" w:after="72" w:line="251" w:lineRule="exact"/>
     </w:pPr>
     <w:rPr>
-      <w:rFonts w:ascii="Noto Serif" w:hAnsi="Noto Serif" w:eastAsia="Noto Serif" w:cs="Noto Serif"/>
+      <w:rFonts w:ascii="Noto Serif" w:hAnsi="Noto Serif" w:cs="Noto Serif" w:eastAsia="Noto Serif CJK SC"/>
       <w:color w:val="1D1D1B"/>
       <w:sz w:val="16"/>
     </w:rPr>

</xml_diff>